<commit_message>
added code to talk to ext DA chip for Digitimer 8R
</commit_message>
<xml_diff>
--- a/varia.docx
+++ b/varia.docx
@@ -151,7 +151,21 @@
         <w:rPr>
           <w:lang w:val="en-US"/>
         </w:rPr>
-        <w:t xml:space="preserve">-Ulock:w:0x2F:m </w:t>
+        <w:t>-</w:t>
+      </w:r>
+      <w:proofErr w:type="gramStart"/>
+      <w:r>
+        <w:rPr>
+          <w:lang w:val="en-US"/>
+        </w:rPr>
+        <w:t>Ulock:w</w:t>
+      </w:r>
+      <w:proofErr w:type="gramEnd"/>
+      <w:r>
+        <w:rPr>
+          <w:lang w:val="en-US"/>
+        </w:rPr>
+        <w:t xml:space="preserve">:0x2F:m </w:t>
       </w:r>
       <w:r>
         <w:rPr>
@@ -175,7 +189,21 @@
         <w:rPr>
           <w:lang w:val="en-US"/>
         </w:rPr>
-        <w:t xml:space="preserve"> the Leonardo exposes COM13 for upload. As usual. Let’s see whether we can now flash again. Yes, works like a charm… So something seems to be broken with the A-Star Pololu bootloader.</w:t>
+        <w:t xml:space="preserve"> the Leonardo exposes COM13 for upload. As usual. Let’s see whether we can now flash again. Yes, works like a charm… </w:t>
+      </w:r>
+      <w:proofErr w:type="gramStart"/>
+      <w:r>
+        <w:rPr>
+          <w:lang w:val="en-US"/>
+        </w:rPr>
+        <w:t>So</w:t>
+      </w:r>
+      <w:proofErr w:type="gramEnd"/>
+      <w:r>
+        <w:rPr>
+          <w:lang w:val="en-US"/>
+        </w:rPr>
+        <w:t xml:space="preserve"> something seems to be broken with the A-Star Pololu bootloader.</w:t>
       </w:r>
     </w:p>
     <w:p>
@@ -312,7 +340,21 @@
         <w:rPr>
           <w:lang w:val="en-US"/>
         </w:rPr>
-        <w:t>$timeout = [DateTime]::Now.AddSeconds(10)</w:t>
+        <w:t>$timeout = [DateTime</w:t>
+      </w:r>
+      <w:proofErr w:type="gramStart"/>
+      <w:r>
+        <w:rPr>
+          <w:lang w:val="en-US"/>
+        </w:rPr>
+        <w:t>]::</w:t>
+      </w:r>
+      <w:proofErr w:type="gramEnd"/>
+      <w:r>
+        <w:rPr>
+          <w:lang w:val="en-US"/>
+        </w:rPr>
+        <w:t>Now.AddSeconds(10)</w:t>
       </w:r>
     </w:p>
     <w:p>
@@ -334,7 +376,21 @@
         <w:rPr>
           <w:lang w:val="en-US"/>
         </w:rPr>
-        <w:t>while (-not $bootPort -and [DateTime]::Now -lt $timeout) {</w:t>
+        <w:t>while (-not $bootPort -and [DateTime</w:t>
+      </w:r>
+      <w:proofErr w:type="gramStart"/>
+      <w:r>
+        <w:rPr>
+          <w:lang w:val="en-US"/>
+        </w:rPr>
+        <w:t>]::</w:t>
+      </w:r>
+      <w:proofErr w:type="gramEnd"/>
+      <w:r>
+        <w:rPr>
+          <w:lang w:val="en-US"/>
+        </w:rPr>
+        <w:t>Now -lt $timeout) {</w:t>
       </w:r>
     </w:p>
     <w:p>
@@ -402,7 +458,34 @@
         <w:rPr>
           <w:lang w:val="en-US"/>
         </w:rPr>
-        <w:t xml:space="preserve"> What is important is that the build environment is set to the bootloader. That’s because the startup sequence relies on the 32u4 to be approachable via CDC (serial protocol). The CDC code for original Leonardo and the A-star implementation is different (the VID:HID differ). This a</w:t>
+        <w:t xml:space="preserve"> What is important is that the build environment is set to the bootloader. That’s because the startup sequence relies on the 32u4 to be approachable via CDC (serial protocol). The CDC code for original Leonardo and the A-star implementation is different (the </w:t>
+      </w:r>
+      <w:proofErr w:type="gramStart"/>
+      <w:r>
+        <w:rPr>
+          <w:lang w:val="en-US"/>
+        </w:rPr>
+        <w:t>VID:HID</w:t>
+      </w:r>
+      <w:proofErr w:type="gramEnd"/>
+      <w:r>
+        <w:rPr>
+          <w:lang w:val="en-US"/>
+        </w:rPr>
+        <w:t xml:space="preserve"> differ). </w:t>
+      </w:r>
+    </w:p>
+    <w:p>
+      <w:pPr>
+        <w:rPr>
+          <w:lang w:val="en-US"/>
+        </w:rPr>
+      </w:pPr>
+      <w:r>
+        <w:rPr>
+          <w:lang w:val="en-US"/>
+        </w:rPr>
+        <w:t>Let’s keep the Leonardo bootloader for now!</w:t>
       </w:r>
     </w:p>
     <w:sectPr>
@@ -1018,6 +1101,7 @@
   <w:style w:type="character" w:default="1" w:styleId="Absatz-Standardschriftart">
     <w:name w:val="Default Paragraph Font"/>
     <w:uiPriority w:val="1"/>
+    <w:semiHidden/>
     <w:unhideWhenUsed/>
   </w:style>
   <w:style w:type="table" w:default="1" w:styleId="NormaleTabelle">

</xml_diff>